<commit_message>
update documentation for 3.5 release
</commit_message>
<xml_diff>
--- a/documentation/Log of Model Program Changes for the CDM.docx
+++ b/documentation/Log of Model Program Changes for the CDM.docx
@@ -47,6 +47,30 @@
           <w:szCs w:val="22"/>
         </w:rPr>
         <w:t>The CDM is continuously being updated as new questions are being asked, new data become available etc. Here we outline the major changes and updates made with each model version.</w:t>
+      </w:r>
+      <w:r>
+        <w:rPr>
+          <w:rFonts w:ascii="Calibri" w:hAnsi="Calibri"/>
+          <w:sz w:val="22"/>
+          <w:szCs w:val="22"/>
+        </w:rPr>
+        <w:t xml:space="preserve"> More on these specific changes can be found in “</w:t>
+      </w:r>
+      <w:r>
+        <w:rPr>
+          <w:rFonts w:ascii="Calibri" w:hAnsi="Calibri"/>
+          <w:sz w:val="22"/>
+          <w:szCs w:val="22"/>
+        </w:rPr>
+        <w:t>CEPAC Dynamic Model Detailed Change Log.docx</w:t>
+      </w:r>
+      <w:r>
+        <w:rPr>
+          <w:rFonts w:ascii="Calibri" w:hAnsi="Calibri"/>
+          <w:sz w:val="22"/>
+          <w:szCs w:val="22"/>
+        </w:rPr>
+        <w:t>”.</w:t>
       </w:r>
     </w:p>
     <w:p>
@@ -238,6 +262,469 @@
                 <w:sz w:val="22"/>
                 <w:szCs w:val="22"/>
               </w:rPr>
+              <w:t>3.5.0</w:t>
+            </w:r>
+          </w:p>
+        </w:tc>
+        <w:tc>
+          <w:tcPr>
+            <w:tcW w:w="1080" w:type="dxa"/>
+          </w:tcPr>
+          <w:p>
+            <w:pPr>
+              <w:rPr>
+                <w:rFonts w:ascii="Calibri" w:hAnsi="Calibri"/>
+                <w:sz w:val="22"/>
+                <w:szCs w:val="22"/>
+              </w:rPr>
+            </w:pPr>
+            <w:r>
+              <w:rPr>
+                <w:rFonts w:ascii="Calibri" w:hAnsi="Calibri"/>
+                <w:sz w:val="22"/>
+                <w:szCs w:val="22"/>
+              </w:rPr>
+              <w:t>6/16/14</w:t>
+            </w:r>
+          </w:p>
+        </w:tc>
+        <w:tc>
+          <w:tcPr>
+            <w:tcW w:w="1350" w:type="dxa"/>
+          </w:tcPr>
+          <w:p>
+            <w:pPr>
+              <w:rPr>
+                <w:rFonts w:ascii="Calibri" w:hAnsi="Calibri"/>
+                <w:sz w:val="22"/>
+                <w:szCs w:val="22"/>
+              </w:rPr>
+            </w:pPr>
+          </w:p>
+        </w:tc>
+        <w:tc>
+          <w:tcPr>
+            <w:tcW w:w="1080" w:type="dxa"/>
+          </w:tcPr>
+          <w:p>
+            <w:pPr>
+              <w:rPr>
+                <w:rFonts w:ascii="Calibri" w:hAnsi="Calibri"/>
+                <w:sz w:val="22"/>
+                <w:szCs w:val="22"/>
+              </w:rPr>
+            </w:pPr>
+            <w:r>
+              <w:rPr>
+                <w:rFonts w:ascii="Calibri" w:hAnsi="Calibri"/>
+                <w:sz w:val="22"/>
+                <w:szCs w:val="22"/>
+              </w:rPr>
+              <w:t>4.4a</w:t>
+            </w:r>
+          </w:p>
+        </w:tc>
+        <w:tc>
+          <w:tcPr>
+            <w:tcW w:w="9720" w:type="dxa"/>
+          </w:tcPr>
+          <w:p>
+            <w:pPr>
+              <w:numPr>
+                <w:ilvl w:val="0"/>
+                <w:numId w:val="24"/>
+              </w:numPr>
+              <w:rPr>
+                <w:rFonts w:ascii="Calibri" w:hAnsi="Calibri"/>
+                <w:sz w:val="22"/>
+                <w:szCs w:val="22"/>
+              </w:rPr>
+            </w:pPr>
+            <w:r>
+              <w:rPr>
+                <w:rFonts w:ascii="Calibri" w:hAnsi="Calibri"/>
+                <w:sz w:val="22"/>
+                <w:szCs w:val="22"/>
+              </w:rPr>
+              <w:t>Added the concept of groups to the model. These groups are all people that satisfy a set of inclusion criteria. They are further subdivided into partitions percentage-wise. Each partition can receive zero or more interventions. Outcomes for each partition are recorded in InterventionOutcomes.xls.</w:t>
+            </w:r>
+          </w:p>
+          <w:p>
+            <w:pPr>
+              <w:numPr>
+                <w:ilvl w:val="0"/>
+                <w:numId w:val="24"/>
+              </w:numPr>
+              <w:rPr>
+                <w:rFonts w:ascii="Calibri" w:hAnsi="Calibri"/>
+                <w:sz w:val="22"/>
+                <w:szCs w:val="22"/>
+              </w:rPr>
+            </w:pPr>
+            <w:r>
+              <w:rPr>
+                <w:rFonts w:ascii="Calibri" w:hAnsi="Calibri"/>
+                <w:sz w:val="22"/>
+                <w:szCs w:val="22"/>
+              </w:rPr>
+              <w:t xml:space="preserve">Added behaviors for HPTN068. </w:t>
+            </w:r>
+            <w:proofErr w:type="spellStart"/>
+            <w:proofErr w:type="gramStart"/>
+            <w:r>
+              <w:rPr>
+                <w:rFonts w:ascii="Calibri" w:hAnsi="Calibri"/>
+                <w:sz w:val="22"/>
+                <w:szCs w:val="22"/>
+              </w:rPr>
+              <w:t>overrideCondomUseChance</w:t>
+            </w:r>
+            <w:proofErr w:type="spellEnd"/>
+            <w:proofErr w:type="gramEnd"/>
+            <w:r>
+              <w:rPr>
+                <w:rFonts w:ascii="Calibri" w:hAnsi="Calibri"/>
+                <w:sz w:val="22"/>
+                <w:szCs w:val="22"/>
+              </w:rPr>
+              <w:t xml:space="preserve"> allows a female to override her male partner’s chance of using a condom. </w:t>
+            </w:r>
+            <w:proofErr w:type="spellStart"/>
+            <w:proofErr w:type="gramStart"/>
+            <w:r>
+              <w:rPr>
+                <w:rFonts w:ascii="Calibri" w:hAnsi="Calibri"/>
+                <w:sz w:val="22"/>
+                <w:szCs w:val="22"/>
+              </w:rPr>
+              <w:t>sexualActivityDelay</w:t>
+            </w:r>
+            <w:proofErr w:type="spellEnd"/>
+            <w:proofErr w:type="gramEnd"/>
+            <w:r>
+              <w:rPr>
+                <w:rFonts w:ascii="Calibri" w:hAnsi="Calibri"/>
+                <w:sz w:val="22"/>
+                <w:szCs w:val="22"/>
+              </w:rPr>
+              <w:t xml:space="preserve"> allows a person to join the sexually active population while not being able to be selected for or form partnerships. </w:t>
+            </w:r>
+            <w:proofErr w:type="spellStart"/>
+            <w:proofErr w:type="gramStart"/>
+            <w:r>
+              <w:rPr>
+                <w:rFonts w:ascii="Calibri" w:hAnsi="Calibri"/>
+                <w:sz w:val="22"/>
+                <w:szCs w:val="22"/>
+              </w:rPr>
+              <w:t>partnershipRejectionChance</w:t>
+            </w:r>
+            <w:proofErr w:type="spellEnd"/>
+            <w:proofErr w:type="gramEnd"/>
+            <w:r>
+              <w:rPr>
+                <w:rFonts w:ascii="Calibri" w:hAnsi="Calibri"/>
+                <w:sz w:val="22"/>
+                <w:szCs w:val="22"/>
+              </w:rPr>
+              <w:t xml:space="preserve"> gives females a chance to reject partnerships of a certain type.</w:t>
+            </w:r>
+          </w:p>
+          <w:p>
+            <w:pPr>
+              <w:numPr>
+                <w:ilvl w:val="0"/>
+                <w:numId w:val="24"/>
+              </w:numPr>
+              <w:rPr>
+                <w:rFonts w:ascii="Calibri" w:hAnsi="Calibri"/>
+                <w:sz w:val="22"/>
+                <w:szCs w:val="22"/>
+              </w:rPr>
+            </w:pPr>
+            <w:r>
+              <w:rPr>
+                <w:rFonts w:ascii="Calibri" w:hAnsi="Calibri"/>
+                <w:sz w:val="22"/>
+                <w:szCs w:val="22"/>
+              </w:rPr>
+              <w:t xml:space="preserve">Removed </w:t>
+            </w:r>
+            <w:proofErr w:type="spellStart"/>
+            <w:r>
+              <w:rPr>
+                <w:rFonts w:ascii="Calibri" w:hAnsi="Calibri"/>
+                <w:sz w:val="22"/>
+                <w:szCs w:val="22"/>
+              </w:rPr>
+              <w:t>assortativeness</w:t>
+            </w:r>
+            <w:proofErr w:type="spellEnd"/>
+            <w:r>
+              <w:rPr>
+                <w:rFonts w:ascii="Calibri" w:hAnsi="Calibri"/>
+                <w:sz w:val="22"/>
+                <w:szCs w:val="22"/>
+              </w:rPr>
+              <w:t xml:space="preserve"> as an intervention target.</w:t>
+            </w:r>
+          </w:p>
+          <w:p>
+            <w:pPr>
+              <w:numPr>
+                <w:ilvl w:val="0"/>
+                <w:numId w:val="24"/>
+              </w:numPr>
+              <w:rPr>
+                <w:rFonts w:ascii="Calibri" w:hAnsi="Calibri"/>
+                <w:sz w:val="22"/>
+                <w:szCs w:val="22"/>
+              </w:rPr>
+            </w:pPr>
+            <w:r>
+              <w:rPr>
+                <w:rFonts w:ascii="Calibri" w:hAnsi="Calibri"/>
+                <w:sz w:val="22"/>
+                <w:szCs w:val="22"/>
+              </w:rPr>
+              <w:t>Fixed bug in random seed.</w:t>
+            </w:r>
+          </w:p>
+          <w:p>
+            <w:pPr>
+              <w:numPr>
+                <w:ilvl w:val="0"/>
+                <w:numId w:val="24"/>
+              </w:numPr>
+              <w:rPr>
+                <w:rFonts w:ascii="Calibri" w:hAnsi="Calibri"/>
+                <w:sz w:val="22"/>
+                <w:szCs w:val="22"/>
+              </w:rPr>
+            </w:pPr>
+            <w:r>
+              <w:rPr>
+                <w:rFonts w:ascii="Calibri" w:hAnsi="Calibri"/>
+                <w:sz w:val="22"/>
+                <w:szCs w:val="22"/>
+              </w:rPr>
+              <w:t>Added file that traces the first 1000 people infected in the model so that a graph of transmission can be visualized.</w:t>
+            </w:r>
+          </w:p>
+          <w:p>
+            <w:pPr>
+              <w:numPr>
+                <w:ilvl w:val="0"/>
+                <w:numId w:val="24"/>
+              </w:numPr>
+              <w:rPr>
+                <w:rFonts w:ascii="Calibri" w:hAnsi="Calibri"/>
+                <w:sz w:val="22"/>
+                <w:szCs w:val="22"/>
+              </w:rPr>
+            </w:pPr>
+            <w:r>
+              <w:rPr>
+                <w:rFonts w:ascii="Calibri" w:hAnsi="Calibri"/>
+                <w:sz w:val="22"/>
+                <w:szCs w:val="22"/>
+              </w:rPr>
+              <w:t>Removed template parameters from XML. Interventions are now given through a fixed mapping of XML elements to interventions.</w:t>
+            </w:r>
+            <w:bookmarkStart w:id="0" w:name="_GoBack"/>
+            <w:bookmarkEnd w:id="0"/>
+          </w:p>
+        </w:tc>
+      </w:tr>
+      <w:tr>
+        <w:tc>
+          <w:tcPr>
+            <w:tcW w:w="918" w:type="dxa"/>
+          </w:tcPr>
+          <w:p>
+            <w:pPr>
+              <w:rPr>
+                <w:rFonts w:ascii="Calibri" w:hAnsi="Calibri"/>
+                <w:sz w:val="22"/>
+                <w:szCs w:val="22"/>
+              </w:rPr>
+            </w:pPr>
+            <w:r>
+              <w:rPr>
+                <w:rFonts w:ascii="Calibri" w:hAnsi="Calibri"/>
+                <w:sz w:val="22"/>
+                <w:szCs w:val="22"/>
+              </w:rPr>
+              <w:t>3.4.2</w:t>
+            </w:r>
+          </w:p>
+        </w:tc>
+        <w:tc>
+          <w:tcPr>
+            <w:tcW w:w="1080" w:type="dxa"/>
+          </w:tcPr>
+          <w:p>
+            <w:pPr>
+              <w:rPr>
+                <w:rFonts w:ascii="Calibri" w:hAnsi="Calibri"/>
+                <w:sz w:val="22"/>
+                <w:szCs w:val="22"/>
+              </w:rPr>
+            </w:pPr>
+            <w:r>
+              <w:rPr>
+                <w:rFonts w:ascii="Calibri" w:hAnsi="Calibri"/>
+                <w:sz w:val="22"/>
+                <w:szCs w:val="22"/>
+              </w:rPr>
+              <w:t>5/5/14</w:t>
+            </w:r>
+          </w:p>
+        </w:tc>
+        <w:tc>
+          <w:tcPr>
+            <w:tcW w:w="1350" w:type="dxa"/>
+          </w:tcPr>
+          <w:p>
+            <w:pPr>
+              <w:rPr>
+                <w:rFonts w:ascii="Calibri" w:hAnsi="Calibri"/>
+                <w:sz w:val="22"/>
+                <w:szCs w:val="22"/>
+              </w:rPr>
+            </w:pPr>
+          </w:p>
+        </w:tc>
+        <w:tc>
+          <w:tcPr>
+            <w:tcW w:w="1080" w:type="dxa"/>
+          </w:tcPr>
+          <w:p>
+            <w:pPr>
+              <w:rPr>
+                <w:rFonts w:ascii="Calibri" w:hAnsi="Calibri"/>
+                <w:sz w:val="22"/>
+                <w:szCs w:val="22"/>
+              </w:rPr>
+            </w:pPr>
+          </w:p>
+        </w:tc>
+        <w:tc>
+          <w:tcPr>
+            <w:tcW w:w="9720" w:type="dxa"/>
+          </w:tcPr>
+          <w:p>
+            <w:pPr>
+              <w:ind w:left="720"/>
+              <w:rPr>
+                <w:rFonts w:ascii="Calibri" w:hAnsi="Calibri"/>
+                <w:sz w:val="22"/>
+                <w:szCs w:val="22"/>
+              </w:rPr>
+            </w:pPr>
+          </w:p>
+        </w:tc>
+      </w:tr>
+      <w:tr>
+        <w:tc>
+          <w:tcPr>
+            <w:tcW w:w="918" w:type="dxa"/>
+          </w:tcPr>
+          <w:p>
+            <w:pPr>
+              <w:rPr>
+                <w:rFonts w:ascii="Calibri" w:hAnsi="Calibri"/>
+                <w:sz w:val="22"/>
+                <w:szCs w:val="22"/>
+              </w:rPr>
+            </w:pPr>
+            <w:r>
+              <w:rPr>
+                <w:rFonts w:ascii="Calibri" w:hAnsi="Calibri"/>
+                <w:sz w:val="22"/>
+                <w:szCs w:val="22"/>
+              </w:rPr>
+              <w:t>3.4.1</w:t>
+            </w:r>
+          </w:p>
+        </w:tc>
+        <w:tc>
+          <w:tcPr>
+            <w:tcW w:w="1080" w:type="dxa"/>
+          </w:tcPr>
+          <w:p>
+            <w:pPr>
+              <w:rPr>
+                <w:rFonts w:ascii="Calibri" w:hAnsi="Calibri"/>
+                <w:sz w:val="22"/>
+                <w:szCs w:val="22"/>
+              </w:rPr>
+            </w:pPr>
+          </w:p>
+        </w:tc>
+        <w:tc>
+          <w:tcPr>
+            <w:tcW w:w="1350" w:type="dxa"/>
+          </w:tcPr>
+          <w:p>
+            <w:pPr>
+              <w:rPr>
+                <w:rFonts w:ascii="Calibri" w:hAnsi="Calibri"/>
+                <w:sz w:val="22"/>
+                <w:szCs w:val="22"/>
+              </w:rPr>
+            </w:pPr>
+          </w:p>
+        </w:tc>
+        <w:tc>
+          <w:tcPr>
+            <w:tcW w:w="1080" w:type="dxa"/>
+          </w:tcPr>
+          <w:p>
+            <w:pPr>
+              <w:rPr>
+                <w:rFonts w:ascii="Calibri" w:hAnsi="Calibri"/>
+                <w:sz w:val="22"/>
+                <w:szCs w:val="22"/>
+              </w:rPr>
+            </w:pPr>
+          </w:p>
+        </w:tc>
+        <w:tc>
+          <w:tcPr>
+            <w:tcW w:w="9720" w:type="dxa"/>
+          </w:tcPr>
+          <w:p>
+            <w:pPr>
+              <w:ind w:left="720"/>
+              <w:rPr>
+                <w:rFonts w:ascii="Calibri" w:hAnsi="Calibri"/>
+                <w:sz w:val="22"/>
+                <w:szCs w:val="22"/>
+              </w:rPr>
+            </w:pPr>
+          </w:p>
+        </w:tc>
+      </w:tr>
+      <w:tr>
+        <w:tc>
+          <w:tcPr>
+            <w:tcW w:w="918" w:type="dxa"/>
+          </w:tcPr>
+          <w:p>
+            <w:pPr>
+              <w:rPr>
+                <w:rFonts w:ascii="Calibri" w:hAnsi="Calibri"/>
+                <w:sz w:val="22"/>
+                <w:szCs w:val="22"/>
+              </w:rPr>
+            </w:pPr>
+            <w:r>
+              <w:rPr>
+                <w:rFonts w:ascii="Calibri" w:hAnsi="Calibri"/>
+                <w:sz w:val="22"/>
+                <w:szCs w:val="22"/>
+              </w:rPr>
               <w:t>3.4.0</w:t>
             </w:r>
           </w:p>
@@ -296,7 +783,7 @@
                 <w:sz w:val="22"/>
                 <w:szCs w:val="22"/>
               </w:rPr>
-              <w:t>4.4a/4.5b</w:t>
+              <w:t>4.4a</w:t>
             </w:r>
           </w:p>
         </w:tc>
@@ -322,23 +809,15 @@
                 <w:sz w:val="22"/>
                 <w:szCs w:val="22"/>
               </w:rPr>
-              <w:t xml:space="preserve">Finished implemented new sequencing method for all </w:t>
-            </w:r>
-            <w:r>
-              <w:rPr>
-                <w:rFonts w:ascii="Calibri" w:hAnsi="Calibri"/>
-                <w:sz w:val="22"/>
-                <w:szCs w:val="22"/>
-              </w:rPr>
-              <w:t xml:space="preserve">possible varying </w:t>
-            </w:r>
-            <w:r>
-              <w:rPr>
-                <w:rFonts w:ascii="Calibri" w:hAnsi="Calibri"/>
-                <w:sz w:val="22"/>
-                <w:szCs w:val="22"/>
-              </w:rPr>
-              <w:t>parameters</w:t>
+              <w:t>Finished implementing</w:t>
+            </w:r>
+            <w:r>
+              <w:rPr>
+                <w:rFonts w:ascii="Calibri" w:hAnsi="Calibri"/>
+                <w:sz w:val="22"/>
+                <w:szCs w:val="22"/>
+              </w:rPr>
+              <w:t xml:space="preserve"> new sequencing method for all possible varying parameters</w:t>
             </w:r>
           </w:p>
           <w:p>
@@ -443,31 +922,8 @@
                 <w:sz w:val="22"/>
                 <w:szCs w:val="22"/>
               </w:rPr>
-              <w:t>GUI and console versions now work on all</w:t>
-            </w:r>
-            <w:r>
-              <w:rPr>
-                <w:rFonts w:ascii="Calibri" w:hAnsi="Calibri"/>
-                <w:sz w:val="22"/>
-                <w:szCs w:val="22"/>
-              </w:rPr>
-              <w:t xml:space="preserve"> used</w:t>
-            </w:r>
-            <w:r>
-              <w:rPr>
-                <w:rFonts w:ascii="Calibri" w:hAnsi="Calibri"/>
-                <w:sz w:val="22"/>
-                <w:szCs w:val="22"/>
-              </w:rPr>
-              <w:t xml:space="preserve"> platforms</w:t>
-            </w:r>
-            <w:r>
-              <w:rPr>
-                <w:rFonts w:ascii="Calibri" w:hAnsi="Calibri"/>
-                <w:sz w:val="22"/>
-                <w:szCs w:val="22"/>
-              </w:rPr>
-              <w:t>.</w:t>
+              <w:lastRenderedPageBreak/>
+              <w:t>GUI and console versions now work on all used platforms.</w:t>
             </w:r>
           </w:p>
           <w:p>
@@ -488,17 +944,7 @@
                 <w:sz w:val="22"/>
                 <w:szCs w:val="22"/>
               </w:rPr>
-              <w:t>XML has been significantly reorganized to be more consistent with regards to naming and sections have been mov</w:t>
-            </w:r>
-            <w:bookmarkStart w:id="0" w:name="_GoBack"/>
-            <w:bookmarkEnd w:id="0"/>
-            <w:r>
-              <w:rPr>
-                <w:rFonts w:ascii="Calibri" w:hAnsi="Calibri"/>
-                <w:sz w:val="22"/>
-                <w:szCs w:val="22"/>
-              </w:rPr>
-              <w:t>ed to more appropriate places.</w:t>
+              <w:t>XML has been significantly reorganized to be more consistent with regards to naming and sections have been moved to more appropriate places.</w:t>
             </w:r>
           </w:p>
           <w:p>
@@ -564,6 +1010,7 @@
                 <w:sz w:val="22"/>
                 <w:szCs w:val="22"/>
               </w:rPr>
+              <w:lastRenderedPageBreak/>
               <w:t>3.34c</w:t>
             </w:r>
           </w:p>
@@ -1215,16 +1662,7 @@
                 <w:sz w:val="22"/>
                 <w:szCs w:val="22"/>
               </w:rPr>
-              <w:t xml:space="preserve">With ART rollout enabled, shuffling of untreated pool (those not yet accessing treatment) was </w:t>
-            </w:r>
-            <w:r>
-              <w:rPr>
-                <w:rFonts w:ascii="Calibri" w:hAnsi="Calibri"/>
-                <w:sz w:val="22"/>
-                <w:szCs w:val="22"/>
-              </w:rPr>
-              <w:lastRenderedPageBreak/>
-              <w:t>previously occurring at the time of infection (potentially before rollout actually starts). The extra resulting random number generator calls were shifting the random number sequence leading to non-reproducible runs between ART rollout disabled/enabled runs. This version delays shuffling of the untreated pool ensuring fully synchronized simulations until rollout actually begins.</w:t>
+              <w:t>With ART rollout enabled, shuffling of untreated pool (those not yet accessing treatment) was previously occurring at the time of infection (potentially before rollout actually starts). The extra resulting random number generator calls were shifting the random number sequence leading to non-reproducible runs between ART rollout disabled/enabled runs. This version delays shuffling of the untreated pool ensuring fully synchronized simulations until rollout actually begins.</w:t>
             </w:r>
           </w:p>
         </w:tc>
@@ -1248,7 +1686,6 @@
                 <w:sz w:val="22"/>
                 <w:szCs w:val="22"/>
               </w:rPr>
-              <w:lastRenderedPageBreak/>
               <w:t>3.32j</w:t>
             </w:r>
           </w:p>
@@ -1506,7 +1943,16 @@
                 <w:sz w:val="22"/>
                 <w:szCs w:val="22"/>
               </w:rPr>
-              <w:t>4. Allow men to search for another partner if they choose the same woman in the same month (refer to specs).</w:t>
+              <w:t xml:space="preserve">4. Allow men to search for another partner if they choose the same woman in the same month (refer to </w:t>
+            </w:r>
+            <w:r>
+              <w:rPr>
+                <w:rFonts w:ascii="Calibri" w:hAnsi="Calibri"/>
+                <w:sz w:val="22"/>
+                <w:szCs w:val="22"/>
+              </w:rPr>
+              <w:lastRenderedPageBreak/>
+              <w:t>specs).</w:t>
             </w:r>
           </w:p>
         </w:tc>
@@ -1530,6 +1976,7 @@
                 <w:sz w:val="22"/>
                 <w:szCs w:val="22"/>
               </w:rPr>
+              <w:lastRenderedPageBreak/>
               <w:t>3.32i</w:t>
             </w:r>
           </w:p>
@@ -1999,7 +2446,6 @@
                 <w:sz w:val="22"/>
                 <w:szCs w:val="22"/>
               </w:rPr>
-              <w:lastRenderedPageBreak/>
               <w:t>3.32g</w:t>
             </w:r>
           </w:p>
@@ -2414,7 +2860,16 @@
                 <w:sz w:val="22"/>
                 <w:szCs w:val="22"/>
               </w:rPr>
-              <w:t>Events file: Columns J to O now specified for SA population; Columns P and Q specified for non-SA population</w:t>
+              <w:t xml:space="preserve">Events file: Columns J to O now specified for SA population; Columns P and Q specified for </w:t>
+            </w:r>
+            <w:r>
+              <w:rPr>
+                <w:rFonts w:ascii="Calibri" w:hAnsi="Calibri" w:cs="Calibri"/>
+                <w:sz w:val="22"/>
+                <w:szCs w:val="22"/>
+              </w:rPr>
+              <w:lastRenderedPageBreak/>
+              <w:t>non-SA population</w:t>
             </w:r>
           </w:p>
           <w:p>
@@ -2646,16 +3101,7 @@
                 <w:sz w:val="22"/>
                 <w:szCs w:val="22"/>
               </w:rPr>
-              <w:t xml:space="preserve"># in Regular partnerships by status (add Male non-single/single CSW, female non-single/single </w:t>
-            </w:r>
-            <w:r>
-              <w:rPr>
-                <w:rFonts w:ascii="Calibri" w:hAnsi="Calibri" w:cs="Calibri"/>
-                <w:sz w:val="22"/>
-                <w:szCs w:val="22"/>
-              </w:rPr>
-              <w:lastRenderedPageBreak/>
-              <w:t>CSW)</w:t>
+              <w:t># in Regular partnerships by status (add Male non-single/single CSW, female non-single/single CSW)</w:t>
             </w:r>
           </w:p>
           <w:p>
@@ -3023,7 +3469,16 @@
                 <w:sz w:val="22"/>
                 <w:szCs w:val="22"/>
               </w:rPr>
-              <w:t xml:space="preserve">- the LE file in the previous version was empty and is now populated </w:t>
+              <w:t xml:space="preserve">- the LE file in the previous version was </w:t>
+            </w:r>
+            <w:r>
+              <w:rPr>
+                <w:rFonts w:ascii="Calibri" w:hAnsi="Calibri"/>
+                <w:sz w:val="22"/>
+                <w:szCs w:val="22"/>
+              </w:rPr>
+              <w:lastRenderedPageBreak/>
+              <w:t xml:space="preserve">empty and is now populated </w:t>
             </w:r>
           </w:p>
           <w:p>
@@ -3064,6 +3519,7 @@
                 <w:sz w:val="22"/>
                 <w:szCs w:val="22"/>
               </w:rPr>
+              <w:lastRenderedPageBreak/>
               <w:t>3.32c</w:t>
             </w:r>
           </w:p>
@@ -3446,16 +3902,7 @@
                 <w:sz w:val="22"/>
                 <w:szCs w:val="22"/>
               </w:rPr>
-              <w:t xml:space="preserve">- Age range will be specified for individuals to become CSW; CSW prevalence stratification by age is now </w:t>
-            </w:r>
-            <w:r>
-              <w:rPr>
-                <w:rFonts w:ascii="Calibri" w:hAnsi="Calibri"/>
-                <w:sz w:val="22"/>
-                <w:szCs w:val="22"/>
-              </w:rPr>
-              <w:lastRenderedPageBreak/>
-              <w:t>removed</w:t>
+              <w:t>- Age range will be specified for individuals to become CSW; CSW prevalence stratification by age is now removed</w:t>
             </w:r>
           </w:p>
           <w:p>
@@ -3513,7 +3960,6 @@
                 <w:sz w:val="22"/>
                 <w:szCs w:val="22"/>
               </w:rPr>
-              <w:lastRenderedPageBreak/>
               <w:t>3.32</w:t>
             </w:r>
           </w:p>
@@ -3823,6 +4269,7 @@
                 <w:sz w:val="22"/>
                 <w:szCs w:val="22"/>
               </w:rPr>
+              <w:lastRenderedPageBreak/>
               <w:t>3.31</w:t>
             </w:r>
           </w:p>
@@ -7014,6 +7461,92 @@
     </w:lvl>
   </w:abstractNum>
   <w:abstractNum w:abstractNumId="22">
+    <w:nsid w:val="78DF520A"/>
+    <w:multiLevelType w:val="hybridMultilevel"/>
+    <w:tmpl w:val="3CB09F68"/>
+    <w:lvl w:ilvl="0" w:tplc="0409000F">
+      <w:start w:val="1"/>
+      <w:numFmt w:val="decimal"/>
+      <w:lvlText w:val="%1."/>
+      <w:lvlJc w:val="left"/>
+      <w:pPr>
+        <w:ind w:left="720" w:hanging="360"/>
+      </w:pPr>
+    </w:lvl>
+    <w:lvl w:ilvl="1" w:tplc="04090019" w:tentative="1">
+      <w:start w:val="1"/>
+      <w:numFmt w:val="lowerLetter"/>
+      <w:lvlText w:val="%2."/>
+      <w:lvlJc w:val="left"/>
+      <w:pPr>
+        <w:ind w:left="1440" w:hanging="360"/>
+      </w:pPr>
+    </w:lvl>
+    <w:lvl w:ilvl="2" w:tplc="0409001B" w:tentative="1">
+      <w:start w:val="1"/>
+      <w:numFmt w:val="lowerRoman"/>
+      <w:lvlText w:val="%3."/>
+      <w:lvlJc w:val="right"/>
+      <w:pPr>
+        <w:ind w:left="2160" w:hanging="180"/>
+      </w:pPr>
+    </w:lvl>
+    <w:lvl w:ilvl="3" w:tplc="0409000F" w:tentative="1">
+      <w:start w:val="1"/>
+      <w:numFmt w:val="decimal"/>
+      <w:lvlText w:val="%4."/>
+      <w:lvlJc w:val="left"/>
+      <w:pPr>
+        <w:ind w:left="2880" w:hanging="360"/>
+      </w:pPr>
+    </w:lvl>
+    <w:lvl w:ilvl="4" w:tplc="04090019" w:tentative="1">
+      <w:start w:val="1"/>
+      <w:numFmt w:val="lowerLetter"/>
+      <w:lvlText w:val="%5."/>
+      <w:lvlJc w:val="left"/>
+      <w:pPr>
+        <w:ind w:left="3600" w:hanging="360"/>
+      </w:pPr>
+    </w:lvl>
+    <w:lvl w:ilvl="5" w:tplc="0409001B" w:tentative="1">
+      <w:start w:val="1"/>
+      <w:numFmt w:val="lowerRoman"/>
+      <w:lvlText w:val="%6."/>
+      <w:lvlJc w:val="right"/>
+      <w:pPr>
+        <w:ind w:left="4320" w:hanging="180"/>
+      </w:pPr>
+    </w:lvl>
+    <w:lvl w:ilvl="6" w:tplc="0409000F" w:tentative="1">
+      <w:start w:val="1"/>
+      <w:numFmt w:val="decimal"/>
+      <w:lvlText w:val="%7."/>
+      <w:lvlJc w:val="left"/>
+      <w:pPr>
+        <w:ind w:left="5040" w:hanging="360"/>
+      </w:pPr>
+    </w:lvl>
+    <w:lvl w:ilvl="7" w:tplc="04090019" w:tentative="1">
+      <w:start w:val="1"/>
+      <w:numFmt w:val="lowerLetter"/>
+      <w:lvlText w:val="%8."/>
+      <w:lvlJc w:val="left"/>
+      <w:pPr>
+        <w:ind w:left="5760" w:hanging="360"/>
+      </w:pPr>
+    </w:lvl>
+    <w:lvl w:ilvl="8" w:tplc="0409001B" w:tentative="1">
+      <w:start w:val="1"/>
+      <w:numFmt w:val="lowerRoman"/>
+      <w:lvlText w:val="%9."/>
+      <w:lvlJc w:val="right"/>
+      <w:pPr>
+        <w:ind w:left="6480" w:hanging="180"/>
+      </w:pPr>
+    </w:lvl>
+  </w:abstractNum>
+  <w:abstractNum w:abstractNumId="23">
     <w:nsid w:val="79224EF6"/>
     <w:multiLevelType w:val="hybridMultilevel"/>
     <w:tmpl w:val="11A06B80"/>
@@ -7163,7 +7696,7 @@
     <w:abstractNumId w:val="11"/>
   </w:num>
   <w:num w:numId="4">
-    <w:abstractNumId w:val="22"/>
+    <w:abstractNumId w:val="23"/>
   </w:num>
   <w:num w:numId="5">
     <w:abstractNumId w:val="4"/>
@@ -7221,6 +7754,9 @@
   </w:num>
   <w:num w:numId="23">
     <w:abstractNumId w:val="10"/>
+  </w:num>
+  <w:num w:numId="24">
+    <w:abstractNumId w:val="22"/>
   </w:num>
 </w:numbering>
 </file>

</xml_diff>